<commit_message>
1 Fokustest results noted
</commit_message>
<xml_diff>
--- a/wild-jam-april-2026/__ORGA/Fokus Tests.docx
+++ b/wild-jam-april-2026/__ORGA/Fokus Tests.docx
@@ -565,7 +565,11 @@
             <w:t>Welche Version wird getestet?</w:t>
           </w:r>
         </w:p>
-        <w:p/>
+        <w:p>
+          <w:r>
+            <w:t>Commit hash: ???</w:t>
+          </w:r>
+        </w:p>
         <w:p/>
         <w:p>
           <w:r>
@@ -613,6 +617,7 @@
             <w:t>Ist das Spiel schon bekannt?</w:t>
           </w:r>
         </w:p>
+        <w:p/>
         <w:p>
           <w:pPr>
             <w:pStyle w:val="Heading4"/>
@@ -621,6 +626,7 @@
             <w:t xml:space="preserve">Altersgruppe </w:t>
           </w:r>
         </w:p>
+        <w:p/>
         <w:p>
           <w:pPr>
             <w:pStyle w:val="Heading4"/>
@@ -629,6 +635,7 @@
             <w:t xml:space="preserve">Generelle Spielerfahrung (Casual Gamer oder Hardcore-Zocker?) </w:t>
           </w:r>
         </w:p>
+        <w:p/>
         <w:p>
           <w:pPr>
             <w:pStyle w:val="Heading4"/>
@@ -647,6 +654,7 @@
           </w:r>
         </w:p>
         <w:p/>
+        <w:p/>
         <w:p>
           <w:pPr>
             <w:pStyle w:val="Heading3"/>
@@ -655,7 +663,15 @@
             <w:t>Beobachtungen beim Spielen, Auftauchende Probleme (halbe Seite)</w:t>
           </w:r>
         </w:p>
-        <w:p/>
+        <w:p>
+          <w:pPr>
+            <w:pStyle w:val="ListParagraph"/>
+            <w:numPr>
+              <w:ilvl w:val="0"/>
+              <w:numId w:val="1"/>
+            </w:numPr>
+          </w:pPr>
+        </w:p>
         <w:p/>
         <w:p>
           <w:pPr>
@@ -779,7 +795,16 @@
             <w:br/>
           </w:r>
           <w:r>
-            <w:t>Die itch.io Seite durfte länger durchgelesen werden als ein durchschnittlicher Spieler das wahrscheinlich getan hätte.</w:t>
+            <w:t xml:space="preserve">Die itch.io Seite durfte </w:t>
+          </w:r>
+          <w:r>
+            <w:t>vollständig</w:t>
+          </w:r>
+          <w:r>
+            <w:t xml:space="preserve"> durchgelesen werden</w:t>
+          </w:r>
+          <w:r>
+            <w:t>.</w:t>
           </w:r>
         </w:p>
         <w:p/>
@@ -838,6 +863,9 @@
           <w:r>
             <w:t>-moderat, eher hardcore</w:t>
           </w:r>
+          <w:r>
+            <w:t xml:space="preserve"> lehnend</w:t>
+          </w:r>
         </w:p>
         <w:p>
           <w:pPr>
@@ -860,6 +888,9 @@
           <w:r>
             <w:t>-ja</w:t>
           </w:r>
+          <w:r>
+            <w:t>, spielt regelmäßig aus eigenem Antrieb Indie-Spiele, ist mit dem Konzept von Game Jams zwecks Ideation vertraut</w:t>
+          </w:r>
         </w:p>
         <w:p/>
         <w:p>
@@ -872,6 +903,11 @@
         </w:p>
         <w:p>
           <w:pPr>
+            <w:pStyle w:val="ListParagraph"/>
+            <w:numPr>
+              <w:ilvl w:val="0"/>
+              <w:numId w:val="1"/>
+            </w:numPr>
             <w:rPr>
               <w:lang w:val="en-DE"/>
             </w:rPr>
@@ -880,7 +916,7 @@
             <w:rPr>
               <w:lang w:val="en-DE"/>
             </w:rPr>
-            <w:t>- “</w:t>
+            <w:t>“</w:t>
           </w:r>
           <w:proofErr w:type="spellStart"/>
           <w:r>
@@ -969,6 +1005,11 @@
         </w:p>
         <w:p>
           <w:pPr>
+            <w:pStyle w:val="ListParagraph"/>
+            <w:numPr>
+              <w:ilvl w:val="0"/>
+              <w:numId w:val="1"/>
+            </w:numPr>
             <w:rPr>
               <w:lang w:val="en-DE"/>
             </w:rPr>
@@ -977,7 +1018,7 @@
             <w:rPr>
               <w:lang w:val="en-DE"/>
             </w:rPr>
-            <w:t>- “</w:t>
+            <w:t>“</w:t>
           </w:r>
           <w:r>
             <w:rPr>
@@ -1086,6 +1127,11 @@
         </w:p>
         <w:p>
           <w:pPr>
+            <w:pStyle w:val="ListParagraph"/>
+            <w:numPr>
+              <w:ilvl w:val="0"/>
+              <w:numId w:val="1"/>
+            </w:numPr>
             <w:rPr>
               <w:lang w:val="en-DE"/>
             </w:rPr>
@@ -1094,12 +1140,6 @@
             <w:rPr>
               <w:lang w:val="en-DE"/>
             </w:rPr>
-            <w:t xml:space="preserve">- </w:t>
-          </w:r>
-          <w:r>
-            <w:rPr>
-              <w:lang w:val="en-DE"/>
-            </w:rPr>
             <w:t xml:space="preserve">Interaction window </w:t>
           </w:r>
           <w:proofErr w:type="spellStart"/>
@@ -1197,6 +1237,11 @@
         </w:p>
         <w:p>
           <w:pPr>
+            <w:pStyle w:val="ListParagraph"/>
+            <w:numPr>
+              <w:ilvl w:val="0"/>
+              <w:numId w:val="1"/>
+            </w:numPr>
             <w:rPr>
               <w:lang w:val="en-DE"/>
             </w:rPr>
@@ -1205,12 +1250,6 @@
             <w:rPr>
               <w:lang w:val="en-DE"/>
             </w:rPr>
-            <w:t xml:space="preserve">- </w:t>
-          </w:r>
-          <w:r>
-            <w:rPr>
-              <w:lang w:val="en-DE"/>
-            </w:rPr>
             <w:t xml:space="preserve">Skill issue </w:t>
           </w:r>
           <w:proofErr w:type="spellStart"/>
@@ -1324,6 +1363,11 @@
         </w:p>
         <w:p>
           <w:pPr>
+            <w:pStyle w:val="ListParagraph"/>
+            <w:numPr>
+              <w:ilvl w:val="0"/>
+              <w:numId w:val="1"/>
+            </w:numPr>
             <w:rPr>
               <w:lang w:val="en-DE"/>
             </w:rPr>
@@ -1332,20 +1376,274 @@
             <w:rPr>
               <w:lang w:val="en-DE"/>
             </w:rPr>
+            <w:t>“</w:t>
+          </w:r>
+          <w:proofErr w:type="spellStart"/>
+          <w:r>
+            <w:rPr>
+              <w:lang w:val="en-DE"/>
+            </w:rPr>
+            <w:t>Warum</w:t>
+          </w:r>
+          <w:proofErr w:type="spellEnd"/>
+          <w:r>
+            <w:rPr>
+              <w:lang w:val="en-DE"/>
+            </w:rPr>
+            <w:t xml:space="preserve"> </w:t>
+          </w:r>
+          <w:proofErr w:type="spellStart"/>
+          <w:r>
+            <w:rPr>
+              <w:lang w:val="en-DE"/>
+            </w:rPr>
+            <w:t>ist</w:t>
+          </w:r>
+          <w:proofErr w:type="spellEnd"/>
+          <w:r>
+            <w:rPr>
+              <w:lang w:val="en-DE"/>
+            </w:rPr>
+            <w:t xml:space="preserve"> </w:t>
+          </w:r>
+          <w:proofErr w:type="spellStart"/>
+          <w:r>
+            <w:rPr>
+              <w:lang w:val="en-DE"/>
+            </w:rPr>
+            <w:t>bananensaft</w:t>
+          </w:r>
+          <w:proofErr w:type="spellEnd"/>
+          <w:r>
+            <w:rPr>
+              <w:lang w:val="en-DE"/>
+            </w:rPr>
+            <w:t xml:space="preserve"> </w:t>
+          </w:r>
+          <w:proofErr w:type="spellStart"/>
+          <w:r>
+            <w:rPr>
+              <w:lang w:val="en-DE"/>
+            </w:rPr>
+            <w:t>lila</w:t>
+          </w:r>
+          <w:proofErr w:type="spellEnd"/>
+          <w:r>
+            <w:rPr>
+              <w:lang w:val="en-DE"/>
+            </w:rPr>
+            <w:t>”</w:t>
+          </w:r>
+          <w:r>
+            <w:rPr>
+              <w:lang w:val="en-DE"/>
+            </w:rPr>
+            <w:t xml:space="preserve">, </w:t>
+          </w:r>
+          <w:proofErr w:type="spellStart"/>
+          <w:r>
+            <w:rPr>
+              <w:lang w:val="en-DE"/>
+            </w:rPr>
+            <w:t>zu</w:t>
+          </w:r>
+          <w:proofErr w:type="spellEnd"/>
+          <w:r>
+            <w:rPr>
+              <w:lang w:val="en-DE"/>
+            </w:rPr>
+            <w:t xml:space="preserve"> </w:t>
+          </w:r>
+          <w:proofErr w:type="spellStart"/>
+          <w:r>
+            <w:rPr>
+              <w:lang w:val="en-DE"/>
+            </w:rPr>
+            <w:t>leicht</w:t>
+          </w:r>
+          <w:proofErr w:type="spellEnd"/>
+          <w:r>
+            <w:rPr>
+              <w:lang w:val="en-DE"/>
+            </w:rPr>
+            <w:t xml:space="preserve"> </w:t>
+          </w:r>
+          <w:proofErr w:type="spellStart"/>
+          <w:r>
+            <w:rPr>
+              <w:lang w:val="en-DE"/>
+            </w:rPr>
+            <w:t>mit</w:t>
+          </w:r>
+          <w:proofErr w:type="spellEnd"/>
+          <w:r>
+            <w:rPr>
+              <w:lang w:val="en-DE"/>
+            </w:rPr>
+            <w:t xml:space="preserve"> </w:t>
+          </w:r>
+          <w:proofErr w:type="spellStart"/>
+          <w:r>
+            <w:rPr>
+              <w:lang w:val="en-DE"/>
+            </w:rPr>
+            <w:t>Kaffee</w:t>
+          </w:r>
+          <w:proofErr w:type="spellEnd"/>
+          <w:r>
+            <w:rPr>
+              <w:lang w:val="en-DE"/>
+            </w:rPr>
+            <w:t xml:space="preserve"> </w:t>
+          </w:r>
+          <w:proofErr w:type="spellStart"/>
+          <w:r>
+            <w:rPr>
+              <w:lang w:val="en-DE"/>
+            </w:rPr>
+            <w:t>zu</w:t>
+          </w:r>
+          <w:proofErr w:type="spellEnd"/>
+          <w:r>
+            <w:rPr>
+              <w:lang w:val="en-DE"/>
+            </w:rPr>
+            <w:t xml:space="preserve"> </w:t>
+          </w:r>
+          <w:proofErr w:type="spellStart"/>
+          <w:r>
+            <w:rPr>
+              <w:lang w:val="en-DE"/>
+            </w:rPr>
+            <w:t>verwechseln</w:t>
+          </w:r>
+          <w:proofErr w:type="spellEnd"/>
+        </w:p>
+        <w:p>
+          <w:pPr>
+            <w:pStyle w:val="ListParagraph"/>
+            <w:numPr>
+              <w:ilvl w:val="0"/>
+              <w:numId w:val="1"/>
+            </w:numPr>
+            <w:rPr>
+              <w:lang w:val="en-DE"/>
+            </w:rPr>
+          </w:pPr>
+          <w:proofErr w:type="spellStart"/>
+          <w:r>
+            <w:rPr>
+              <w:lang w:val="en-DE"/>
+            </w:rPr>
+            <w:t>Bewegen</w:t>
+          </w:r>
+          <w:proofErr w:type="spellEnd"/>
+          <w:r>
+            <w:rPr>
+              <w:lang w:val="en-DE"/>
+            </w:rPr>
+            <w:t xml:space="preserve"> </w:t>
+          </w:r>
+          <w:proofErr w:type="spellStart"/>
+          <w:r>
+            <w:rPr>
+              <w:lang w:val="en-DE"/>
+            </w:rPr>
+            <w:t>während</w:t>
+          </w:r>
+          <w:proofErr w:type="spellEnd"/>
+          <w:r>
+            <w:rPr>
+              <w:lang w:val="en-DE"/>
+            </w:rPr>
+            <w:t xml:space="preserve"> </w:t>
+          </w:r>
+          <w:proofErr w:type="spellStart"/>
+          <w:r>
+            <w:rPr>
+              <w:lang w:val="en-DE"/>
+            </w:rPr>
+            <w:t>Interaktion</w:t>
+          </w:r>
+          <w:proofErr w:type="spellEnd"/>
+          <w:r>
+            <w:rPr>
+              <w:lang w:val="en-DE"/>
+            </w:rPr>
+            <w:t xml:space="preserve"> </w:t>
+          </w:r>
+          <w:proofErr w:type="spellStart"/>
+          <w:r>
+            <w:rPr>
+              <w:lang w:val="en-DE"/>
+            </w:rPr>
+            <w:t>mit</w:t>
+          </w:r>
+          <w:proofErr w:type="spellEnd"/>
+          <w:r>
+            <w:rPr>
+              <w:lang w:val="en-DE"/>
+            </w:rPr>
+            <w:t xml:space="preserve"> Mixer und </w:t>
+          </w:r>
+          <w:proofErr w:type="spellStart"/>
+          <w:r>
+            <w:rPr>
+              <w:lang w:val="en-DE"/>
+            </w:rPr>
+            <w:t>Kaffeemaschine</w:t>
+          </w:r>
+          <w:proofErr w:type="spellEnd"/>
+        </w:p>
+        <w:p>
+          <w:pPr>
+            <w:pStyle w:val="ListParagraph"/>
+            <w:numPr>
+              <w:ilvl w:val="0"/>
+              <w:numId w:val="1"/>
+            </w:numPr>
+            <w:rPr>
+              <w:lang w:val="en-DE"/>
+            </w:rPr>
+          </w:pPr>
+          <w:r>
+            <w:rPr>
+              <w:lang w:val="en-DE"/>
+            </w:rPr>
+            <w:t xml:space="preserve">Kanne </w:t>
+          </w:r>
+          <w:proofErr w:type="spellStart"/>
+          <w:r>
+            <w:rPr>
+              <w:lang w:val="en-DE"/>
+            </w:rPr>
+            <w:t>blockt</w:t>
+          </w:r>
+          <w:proofErr w:type="spellEnd"/>
+          <w:r>
+            <w:rPr>
+              <w:lang w:val="en-DE"/>
+            </w:rPr>
+            <w:t xml:space="preserve"> item</w:t>
+          </w:r>
+          <w:r>
+            <w:rPr>
+              <w:lang w:val="en-DE"/>
+            </w:rPr>
             <w:t>-</w:t>
           </w:r>
           <w:r>
             <w:rPr>
               <w:lang w:val="en-DE"/>
             </w:rPr>
-            <w:t xml:space="preserve"> “</w:t>
-          </w:r>
-          <w:proofErr w:type="spellStart"/>
-          <w:r>
-            <w:rPr>
-              <w:lang w:val="en-DE"/>
-            </w:rPr>
-            <w:t>Warum</w:t>
+            <w:t xml:space="preserve">drop </w:t>
+          </w:r>
+          <w:proofErr w:type="spellStart"/>
+          <w:r>
+            <w:rPr>
+              <w:lang w:val="en-DE"/>
+            </w:rPr>
+            <w:t>bei</w:t>
           </w:r>
           <w:proofErr w:type="spellEnd"/>
           <w:r>
@@ -1359,432 +1657,155 @@
             <w:rPr>
               <w:lang w:val="en-DE"/>
             </w:rPr>
+            <w:t>kunde</w:t>
+          </w:r>
+          <w:proofErr w:type="spellEnd"/>
+        </w:p>
+        <w:p>
+          <w:pPr>
+            <w:pStyle w:val="ListParagraph"/>
+            <w:numPr>
+              <w:ilvl w:val="0"/>
+              <w:numId w:val="1"/>
+            </w:numPr>
+            <w:rPr>
+              <w:lang w:val="en-DE"/>
+            </w:rPr>
+          </w:pPr>
+          <w:proofErr w:type="spellStart"/>
+          <w:r>
+            <w:rPr>
+              <w:lang w:val="en-DE"/>
+            </w:rPr>
+            <w:t>Sprechblase</w:t>
+          </w:r>
+          <w:proofErr w:type="spellEnd"/>
+          <w:r>
+            <w:rPr>
+              <w:lang w:val="en-DE"/>
+            </w:rPr>
+            <w:t xml:space="preserve"> </w:t>
+          </w:r>
+          <w:proofErr w:type="spellStart"/>
+          <w:r>
+            <w:rPr>
+              <w:lang w:val="en-DE"/>
+            </w:rPr>
+            <w:t>nur</w:t>
+          </w:r>
+          <w:proofErr w:type="spellEnd"/>
+          <w:r>
+            <w:rPr>
+              <w:lang w:val="en-DE"/>
+            </w:rPr>
+            <w:t xml:space="preserve"> item </w:t>
+          </w:r>
+          <w:proofErr w:type="spellStart"/>
+          <w:r>
+            <w:rPr>
+              <w:lang w:val="en-DE"/>
+            </w:rPr>
+            <w:t>bild</w:t>
+          </w:r>
+          <w:proofErr w:type="spellEnd"/>
+          <w:r>
+            <w:rPr>
+              <w:lang w:val="en-DE"/>
+            </w:rPr>
+            <w:t xml:space="preserve"> </w:t>
+          </w:r>
+          <w:proofErr w:type="spellStart"/>
+          <w:r>
+            <w:rPr>
+              <w:lang w:val="en-DE"/>
+            </w:rPr>
+            <w:t>kein</w:t>
+          </w:r>
+          <w:proofErr w:type="spellEnd"/>
+          <w:r>
+            <w:rPr>
+              <w:lang w:val="en-DE"/>
+            </w:rPr>
+            <w:t xml:space="preserve"> text und </w:t>
+          </w:r>
+          <w:proofErr w:type="spellStart"/>
+          <w:r>
+            <w:rPr>
+              <w:lang w:val="en-DE"/>
+            </w:rPr>
+            <w:t>zu</w:t>
+          </w:r>
+          <w:proofErr w:type="spellEnd"/>
+          <w:r>
+            <w:rPr>
+              <w:lang w:val="en-DE"/>
+            </w:rPr>
+            <w:t xml:space="preserve"> </w:t>
+          </w:r>
+          <w:proofErr w:type="spellStart"/>
+          <w:r>
+            <w:rPr>
+              <w:lang w:val="en-DE"/>
+            </w:rPr>
+            <w:t>langsam</w:t>
+          </w:r>
+          <w:proofErr w:type="spellEnd"/>
+        </w:p>
+        <w:p>
+          <w:pPr>
+            <w:pStyle w:val="ListParagraph"/>
+            <w:numPr>
+              <w:ilvl w:val="0"/>
+              <w:numId w:val="1"/>
+            </w:numPr>
+            <w:rPr>
+              <w:lang w:val="en-DE"/>
+            </w:rPr>
+          </w:pPr>
+          <w:proofErr w:type="spellStart"/>
+          <w:r>
+            <w:rPr>
+              <w:lang w:val="en-DE"/>
+            </w:rPr>
+            <w:t>Unklar</w:t>
+          </w:r>
+          <w:proofErr w:type="spellEnd"/>
+          <w:r>
+            <w:rPr>
+              <w:lang w:val="en-DE"/>
+            </w:rPr>
+            <w:t xml:space="preserve">, wo die </w:t>
+          </w:r>
+          <w:proofErr w:type="spellStart"/>
+          <w:r>
+            <w:rPr>
+              <w:lang w:val="en-DE"/>
+            </w:rPr>
+            <w:t>interaktion</w:t>
+          </w:r>
+          <w:proofErr w:type="spellEnd"/>
+          <w:r>
+            <w:rPr>
+              <w:lang w:val="en-DE"/>
+            </w:rPr>
+            <w:t xml:space="preserve"> area </w:t>
+          </w:r>
+          <w:proofErr w:type="spellStart"/>
+          <w:r>
+            <w:rPr>
+              <w:lang w:val="en-DE"/>
+            </w:rPr>
             <w:t>ist</w:t>
           </w:r>
           <w:proofErr w:type="spellEnd"/>
-          <w:r>
-            <w:rPr>
-              <w:lang w:val="en-DE"/>
-            </w:rPr>
-            <w:t xml:space="preserve"> </w:t>
-          </w:r>
-          <w:proofErr w:type="spellStart"/>
-          <w:r>
-            <w:rPr>
-              <w:lang w:val="en-DE"/>
-            </w:rPr>
-            <w:t>bananensaft</w:t>
-          </w:r>
-          <w:proofErr w:type="spellEnd"/>
-          <w:r>
-            <w:rPr>
-              <w:lang w:val="en-DE"/>
-            </w:rPr>
-            <w:t xml:space="preserve"> </w:t>
-          </w:r>
-          <w:proofErr w:type="spellStart"/>
-          <w:r>
-            <w:rPr>
-              <w:lang w:val="en-DE"/>
-            </w:rPr>
-            <w:t>lila</w:t>
-          </w:r>
-          <w:proofErr w:type="spellEnd"/>
-          <w:r>
-            <w:rPr>
-              <w:lang w:val="en-DE"/>
-            </w:rPr>
-            <w:t>”</w:t>
-          </w:r>
-          <w:r>
-            <w:rPr>
-              <w:lang w:val="en-DE"/>
-            </w:rPr>
-            <w:t xml:space="preserve">, </w:t>
-          </w:r>
-          <w:proofErr w:type="spellStart"/>
-          <w:r>
-            <w:rPr>
-              <w:lang w:val="en-DE"/>
-            </w:rPr>
-            <w:t>zu</w:t>
-          </w:r>
-          <w:proofErr w:type="spellEnd"/>
-          <w:r>
-            <w:rPr>
-              <w:lang w:val="en-DE"/>
-            </w:rPr>
-            <w:t xml:space="preserve"> </w:t>
-          </w:r>
-          <w:proofErr w:type="spellStart"/>
-          <w:r>
-            <w:rPr>
-              <w:lang w:val="en-DE"/>
-            </w:rPr>
-            <w:t>leicht</w:t>
-          </w:r>
-          <w:proofErr w:type="spellEnd"/>
-          <w:r>
-            <w:rPr>
-              <w:lang w:val="en-DE"/>
-            </w:rPr>
-            <w:t xml:space="preserve"> </w:t>
-          </w:r>
-          <w:proofErr w:type="spellStart"/>
-          <w:r>
-            <w:rPr>
-              <w:lang w:val="en-DE"/>
-            </w:rPr>
-            <w:t>mit</w:t>
-          </w:r>
-          <w:proofErr w:type="spellEnd"/>
-          <w:r>
-            <w:rPr>
-              <w:lang w:val="en-DE"/>
-            </w:rPr>
-            <w:t xml:space="preserve"> </w:t>
-          </w:r>
-          <w:proofErr w:type="spellStart"/>
-          <w:r>
-            <w:rPr>
-              <w:lang w:val="en-DE"/>
-            </w:rPr>
-            <w:t>Kaffee</w:t>
-          </w:r>
-          <w:proofErr w:type="spellEnd"/>
-          <w:r>
-            <w:rPr>
-              <w:lang w:val="en-DE"/>
-            </w:rPr>
-            <w:t xml:space="preserve"> </w:t>
-          </w:r>
-          <w:proofErr w:type="spellStart"/>
-          <w:r>
-            <w:rPr>
-              <w:lang w:val="en-DE"/>
-            </w:rPr>
-            <w:t>zu</w:t>
-          </w:r>
-          <w:proofErr w:type="spellEnd"/>
-          <w:r>
-            <w:rPr>
-              <w:lang w:val="en-DE"/>
-            </w:rPr>
-            <w:t xml:space="preserve"> </w:t>
-          </w:r>
-          <w:proofErr w:type="spellStart"/>
-          <w:r>
-            <w:rPr>
-              <w:lang w:val="en-DE"/>
-            </w:rPr>
-            <w:t>verwechseln</w:t>
-          </w:r>
-          <w:proofErr w:type="spellEnd"/>
-        </w:p>
-        <w:p>
-          <w:pPr>
-            <w:rPr>
-              <w:lang w:val="en-DE"/>
-            </w:rPr>
-          </w:pPr>
-          <w:r>
-            <w:rPr>
-              <w:lang w:val="en-DE"/>
-            </w:rPr>
-            <w:t>-</w:t>
-          </w:r>
-          <w:r>
-            <w:rPr>
-              <w:lang w:val="en-DE"/>
-            </w:rPr>
-            <w:t xml:space="preserve"> </w:t>
-          </w:r>
-          <w:proofErr w:type="spellStart"/>
-          <w:r>
-            <w:rPr>
-              <w:lang w:val="en-DE"/>
-            </w:rPr>
-            <w:t>Bewegen</w:t>
-          </w:r>
-          <w:proofErr w:type="spellEnd"/>
-          <w:r>
-            <w:rPr>
-              <w:lang w:val="en-DE"/>
-            </w:rPr>
-            <w:t xml:space="preserve"> </w:t>
-          </w:r>
-          <w:proofErr w:type="spellStart"/>
-          <w:r>
-            <w:rPr>
-              <w:lang w:val="en-DE"/>
-            </w:rPr>
-            <w:t>während</w:t>
-          </w:r>
-          <w:proofErr w:type="spellEnd"/>
-          <w:r>
-            <w:rPr>
-              <w:lang w:val="en-DE"/>
-            </w:rPr>
-            <w:t xml:space="preserve"> </w:t>
-          </w:r>
-          <w:proofErr w:type="spellStart"/>
-          <w:r>
-            <w:rPr>
-              <w:lang w:val="en-DE"/>
-            </w:rPr>
-            <w:t>Interaktion</w:t>
-          </w:r>
-          <w:proofErr w:type="spellEnd"/>
-          <w:r>
-            <w:rPr>
-              <w:lang w:val="en-DE"/>
-            </w:rPr>
-            <w:t xml:space="preserve"> </w:t>
-          </w:r>
-          <w:proofErr w:type="spellStart"/>
-          <w:r>
-            <w:rPr>
-              <w:lang w:val="en-DE"/>
-            </w:rPr>
-            <w:t>mit</w:t>
-          </w:r>
-          <w:proofErr w:type="spellEnd"/>
-          <w:r>
-            <w:rPr>
-              <w:lang w:val="en-DE"/>
-            </w:rPr>
-            <w:t xml:space="preserve"> Mixer und </w:t>
-          </w:r>
-          <w:proofErr w:type="spellStart"/>
-          <w:r>
-            <w:rPr>
-              <w:lang w:val="en-DE"/>
-            </w:rPr>
-            <w:t>Kaffeemaschine</w:t>
-          </w:r>
-          <w:proofErr w:type="spellEnd"/>
-        </w:p>
-        <w:p>
-          <w:pPr>
-            <w:rPr>
-              <w:lang w:val="en-DE"/>
-            </w:rPr>
-          </w:pPr>
-          <w:r>
-            <w:rPr>
-              <w:lang w:val="en-DE"/>
-            </w:rPr>
-            <w:t>-</w:t>
-          </w:r>
-          <w:r>
-            <w:rPr>
-              <w:lang w:val="en-DE"/>
-            </w:rPr>
-            <w:t xml:space="preserve"> </w:t>
-          </w:r>
-          <w:r>
-            <w:rPr>
-              <w:lang w:val="en-DE"/>
-            </w:rPr>
-            <w:t xml:space="preserve">Kanne </w:t>
-          </w:r>
-          <w:proofErr w:type="spellStart"/>
-          <w:r>
-            <w:rPr>
-              <w:lang w:val="en-DE"/>
-            </w:rPr>
-            <w:t>blockt</w:t>
-          </w:r>
-          <w:proofErr w:type="spellEnd"/>
-          <w:r>
-            <w:rPr>
-              <w:lang w:val="en-DE"/>
-            </w:rPr>
-            <w:t xml:space="preserve"> item</w:t>
-          </w:r>
-          <w:r>
-            <w:rPr>
-              <w:lang w:val="en-DE"/>
-            </w:rPr>
-            <w:t>-</w:t>
-          </w:r>
-          <w:r>
-            <w:rPr>
-              <w:lang w:val="en-DE"/>
-            </w:rPr>
-            <w:t xml:space="preserve">drop </w:t>
-          </w:r>
-          <w:proofErr w:type="spellStart"/>
-          <w:r>
-            <w:rPr>
-              <w:lang w:val="en-DE"/>
-            </w:rPr>
-            <w:t>bei</w:t>
-          </w:r>
-          <w:proofErr w:type="spellEnd"/>
-          <w:r>
-            <w:rPr>
-              <w:lang w:val="en-DE"/>
-            </w:rPr>
-            <w:t xml:space="preserve"> </w:t>
-          </w:r>
-          <w:proofErr w:type="spellStart"/>
-          <w:r>
-            <w:rPr>
-              <w:lang w:val="en-DE"/>
-            </w:rPr>
-            <w:t>kunde</w:t>
-          </w:r>
-          <w:proofErr w:type="spellEnd"/>
-        </w:p>
-        <w:p>
-          <w:pPr>
-            <w:rPr>
-              <w:lang w:val="en-DE"/>
-            </w:rPr>
-          </w:pPr>
-          <w:r>
-            <w:rPr>
-              <w:lang w:val="en-DE"/>
-            </w:rPr>
-            <w:lastRenderedPageBreak/>
-            <w:t xml:space="preserve">- </w:t>
-          </w:r>
-          <w:proofErr w:type="spellStart"/>
-          <w:r>
-            <w:rPr>
-              <w:lang w:val="en-DE"/>
-            </w:rPr>
-            <w:t>Sprechblase</w:t>
-          </w:r>
-          <w:proofErr w:type="spellEnd"/>
-          <w:r>
-            <w:rPr>
-              <w:lang w:val="en-DE"/>
-            </w:rPr>
-            <w:t xml:space="preserve"> </w:t>
-          </w:r>
-          <w:proofErr w:type="spellStart"/>
-          <w:r>
-            <w:rPr>
-              <w:lang w:val="en-DE"/>
-            </w:rPr>
-            <w:t>nur</w:t>
-          </w:r>
-          <w:proofErr w:type="spellEnd"/>
-          <w:r>
-            <w:rPr>
-              <w:lang w:val="en-DE"/>
-            </w:rPr>
-            <w:t xml:space="preserve"> item </w:t>
-          </w:r>
-          <w:proofErr w:type="spellStart"/>
-          <w:r>
-            <w:rPr>
-              <w:lang w:val="en-DE"/>
-            </w:rPr>
-            <w:t>bild</w:t>
-          </w:r>
-          <w:proofErr w:type="spellEnd"/>
-          <w:r>
-            <w:rPr>
-              <w:lang w:val="en-DE"/>
-            </w:rPr>
-            <w:t xml:space="preserve"> </w:t>
-          </w:r>
-          <w:proofErr w:type="spellStart"/>
-          <w:r>
-            <w:rPr>
-              <w:lang w:val="en-DE"/>
-            </w:rPr>
-            <w:t>kein</w:t>
-          </w:r>
-          <w:proofErr w:type="spellEnd"/>
-          <w:r>
-            <w:rPr>
-              <w:lang w:val="en-DE"/>
-            </w:rPr>
-            <w:t xml:space="preserve"> text und </w:t>
-          </w:r>
-          <w:proofErr w:type="spellStart"/>
-          <w:r>
-            <w:rPr>
-              <w:lang w:val="en-DE"/>
-            </w:rPr>
-            <w:t>zu</w:t>
-          </w:r>
-          <w:proofErr w:type="spellEnd"/>
-          <w:r>
-            <w:rPr>
-              <w:lang w:val="en-DE"/>
-            </w:rPr>
-            <w:t xml:space="preserve"> </w:t>
-          </w:r>
-          <w:proofErr w:type="spellStart"/>
-          <w:r>
-            <w:rPr>
-              <w:lang w:val="en-DE"/>
-            </w:rPr>
-            <w:t>langsam</w:t>
-          </w:r>
-          <w:proofErr w:type="spellEnd"/>
-        </w:p>
-        <w:p>
-          <w:pPr>
-            <w:rPr>
-              <w:lang w:val="en-DE"/>
-            </w:rPr>
-          </w:pPr>
-          <w:r>
-            <w:rPr>
-              <w:lang w:val="en-DE"/>
-            </w:rPr>
-            <w:t xml:space="preserve">- </w:t>
-          </w:r>
-          <w:proofErr w:type="spellStart"/>
-          <w:r>
-            <w:rPr>
-              <w:lang w:val="en-DE"/>
-            </w:rPr>
-            <w:t>Unklar</w:t>
-          </w:r>
-          <w:proofErr w:type="spellEnd"/>
-          <w:r>
-            <w:rPr>
-              <w:lang w:val="en-DE"/>
-            </w:rPr>
-            <w:t xml:space="preserve">, wo die </w:t>
-          </w:r>
-          <w:proofErr w:type="spellStart"/>
-          <w:r>
-            <w:rPr>
-              <w:lang w:val="en-DE"/>
-            </w:rPr>
-            <w:t>interaktion</w:t>
-          </w:r>
-          <w:proofErr w:type="spellEnd"/>
-          <w:r>
-            <w:rPr>
-              <w:lang w:val="en-DE"/>
-            </w:rPr>
-            <w:t xml:space="preserve"> area </w:t>
-          </w:r>
-          <w:proofErr w:type="spellStart"/>
-          <w:r>
-            <w:rPr>
-              <w:lang w:val="en-DE"/>
-            </w:rPr>
-            <w:t>ist</w:t>
-          </w:r>
-          <w:proofErr w:type="spellEnd"/>
-        </w:p>
-        <w:p/>
+        </w:p>
         <w:p/>
         <w:p>
           <w:pPr>
             <w:pStyle w:val="Heading3"/>
           </w:pPr>
           <w:r>
+            <w:lastRenderedPageBreak/>
             <w:t>M</w:t>
           </w:r>
           <w:r>
@@ -1808,8 +1829,31 @@
         </w:p>
       </w:sdtContent>
     </w:sdt>
-    <w:p/>
-    <w:p/>
+    <w:p>
+      <w:r>
+        <w:t>-Tutorial oder in-game Help-Button, um Unklarheiten in der Steuerung zu beseitigen.</w:t>
+      </w:r>
+      <w:r>
+        <w:br/>
+        <w:t>-Interaktionsfenster beim Kunden nach oben, unten, rechts erweitern</w:t>
+      </w:r>
+      <w:r>
+        <w:br/>
+        <w:t>-Interaktionsfenster des Spielcharakters nach unten und in der horizontalen etwas erweitern</w:t>
+      </w:r>
+      <w:r>
+        <w:br/>
+        <w:t>-Fruchtsaft Farbe ändern, um Kontrast zu Kaffee zu schaffen und Anforderung auch schriftlich anzeigen</w:t>
+      </w:r>
+      <w:r>
+        <w:br/>
+        <w:t>-Küchengeräte ändern. Sodass ihre Interaktion nicht benötigt, dass der Spieler bei ihnen bleibt</w:t>
+      </w:r>
+      <w:r>
+        <w:br/>
+        <w:t>-Interaktionen priorisieren, sodass nie eine unmögliche Interaktion eine mögliche Interaktion blockiert</w:t>
+      </w:r>
+    </w:p>
     <w:sectPr>
       <w:pgSz w:w="11906" w:h="16838"/>
       <w:pgMar w:top="1417" w:right="1417" w:bottom="1134" w:left="1417" w:header="708" w:footer="708" w:gutter="0"/>
@@ -1820,6 +1864,126 @@
     </w:sectPr>
   </w:body>
 </w:document>
+</file>
+
+<file path=word/numbering.xml><?xml version="1.0" encoding="utf-8"?>
+<w:numbering xmlns:wpc="http://schemas.microsoft.com/office/word/2010/wordprocessingCanvas" xmlns:cx="http://schemas.microsoft.com/office/drawing/2014/chartex" xmlns:cx1="http://schemas.microsoft.com/office/drawing/2015/9/8/chartex" xmlns:cx2="http://schemas.microsoft.com/office/drawing/2015/10/21/chartex" xmlns:cx3="http://schemas.microsoft.com/office/drawing/2016/5/9/chartex" xmlns:cx4="http://schemas.microsoft.com/office/drawing/2016/5/10/chartex" xmlns:cx5="http://schemas.microsoft.com/office/drawing/2016/5/11/chartex" xmlns:cx6="http://schemas.microsoft.com/office/drawing/2016/5/12/chartex" xmlns:cx7="http://schemas.microsoft.com/office/drawing/2016/5/13/chartex" xmlns:cx8="http://schemas.microsoft.com/office/drawing/2016/5/14/chartex" xmlns:mc="http://schemas.openxmlformats.org/markup-compatibility/2006" xmlns:aink="http://schemas.microsoft.com/office/drawing/2016/ink" xmlns:am3d="http://schemas.microsoft.com/office/drawing/2017/model3d" xmlns:o="urn:schemas-microsoft-com:office:office" xmlns:oel="http://schemas.microsoft.com/office/2019/extlst" xmlns:r="http://schemas.openxmlformats.org/officeDocument/2006/relationships" xmlns:m="http://schemas.openxmlformats.org/officeDocument/2006/math" xmlns:v="urn:schemas-microsoft-com:vml" xmlns:wp14="http://schemas.microsoft.com/office/word/2010/wordprocessingDrawing" xmlns:wp="http://schemas.openxmlformats.org/drawingml/2006/wordprocessingDrawing" xmlns:w10="urn:schemas-microsoft-com:office:word" xmlns:w="http://schemas.openxmlformats.org/wordprocessingml/2006/main" xmlns:w14="http://schemas.microsoft.com/office/word/2010/wordml" xmlns:w15="http://schemas.microsoft.com/office/word/2012/wordml" xmlns:w16cex="http://schemas.microsoft.com/office/word/2018/wordml/cex" xmlns:w16cid="http://schemas.microsoft.com/office/word/2016/wordml/cid" xmlns:w16="http://schemas.microsoft.com/office/word/2018/wordml" xmlns:w16du="http://schemas.microsoft.com/office/word/2023/wordml/word16du" xmlns:w16sdtdh="http://schemas.microsoft.com/office/word/2020/wordml/sdtdatahash" xmlns:w16sdtfl="http://schemas.microsoft.com/office/word/2024/wordml/sdtformatlock" xmlns:w16se="http://schemas.microsoft.com/office/word/2015/wordml/symex" xmlns:wpg="http://schemas.microsoft.com/office/word/2010/wordprocessingGroup" xmlns:wpi="http://schemas.microsoft.com/office/word/2010/wordprocessingInk" xmlns:wne="http://schemas.microsoft.com/office/word/2006/wordml" xmlns:wps="http://schemas.microsoft.com/office/word/2010/wordprocessingShape" mc:Ignorable="w14 w15 w16se w16cid w16 w16cex w16sdtdh w16sdtfl w16du wp14">
+  <w:abstractNum w:abstractNumId="0" w15:restartNumberingAfterBreak="0">
+    <w:nsid w:val="5E3E291D"/>
+    <w:multiLevelType w:val="hybridMultilevel"/>
+    <w:tmpl w:val="05CA64C4"/>
+    <w:lvl w:ilvl="0" w:tplc="5ECC105C">
+      <w:numFmt w:val="bullet"/>
+      <w:lvlText w:val="-"/>
+      <w:lvlJc w:val="left"/>
+      <w:pPr>
+        <w:ind w:left="720" w:hanging="360"/>
+      </w:pPr>
+      <w:rPr>
+        <w:rFonts w:ascii="Aptos" w:eastAsiaTheme="minorHAnsi" w:hAnsi="Aptos" w:cstheme="minorBidi" w:hint="default"/>
+      </w:rPr>
+    </w:lvl>
+    <w:lvl w:ilvl="1" w:tplc="20000003" w:tentative="1">
+      <w:start w:val="1"/>
+      <w:numFmt w:val="bullet"/>
+      <w:lvlText w:val="o"/>
+      <w:lvlJc w:val="left"/>
+      <w:pPr>
+        <w:ind w:left="1440" w:hanging="360"/>
+      </w:pPr>
+      <w:rPr>
+        <w:rFonts w:ascii="Courier New" w:hAnsi="Courier New" w:cs="Courier New" w:hint="default"/>
+      </w:rPr>
+    </w:lvl>
+    <w:lvl w:ilvl="2" w:tplc="20000005" w:tentative="1">
+      <w:start w:val="1"/>
+      <w:numFmt w:val="bullet"/>
+      <w:lvlText w:val=""/>
+      <w:lvlJc w:val="left"/>
+      <w:pPr>
+        <w:ind w:left="2160" w:hanging="360"/>
+      </w:pPr>
+      <w:rPr>
+        <w:rFonts w:ascii="Wingdings" w:hAnsi="Wingdings" w:hint="default"/>
+      </w:rPr>
+    </w:lvl>
+    <w:lvl w:ilvl="3" w:tplc="20000001" w:tentative="1">
+      <w:start w:val="1"/>
+      <w:numFmt w:val="bullet"/>
+      <w:lvlText w:val=""/>
+      <w:lvlJc w:val="left"/>
+      <w:pPr>
+        <w:ind w:left="2880" w:hanging="360"/>
+      </w:pPr>
+      <w:rPr>
+        <w:rFonts w:ascii="Symbol" w:hAnsi="Symbol" w:hint="default"/>
+      </w:rPr>
+    </w:lvl>
+    <w:lvl w:ilvl="4" w:tplc="20000003" w:tentative="1">
+      <w:start w:val="1"/>
+      <w:numFmt w:val="bullet"/>
+      <w:lvlText w:val="o"/>
+      <w:lvlJc w:val="left"/>
+      <w:pPr>
+        <w:ind w:left="3600" w:hanging="360"/>
+      </w:pPr>
+      <w:rPr>
+        <w:rFonts w:ascii="Courier New" w:hAnsi="Courier New" w:cs="Courier New" w:hint="default"/>
+      </w:rPr>
+    </w:lvl>
+    <w:lvl w:ilvl="5" w:tplc="20000005" w:tentative="1">
+      <w:start w:val="1"/>
+      <w:numFmt w:val="bullet"/>
+      <w:lvlText w:val=""/>
+      <w:lvlJc w:val="left"/>
+      <w:pPr>
+        <w:ind w:left="4320" w:hanging="360"/>
+      </w:pPr>
+      <w:rPr>
+        <w:rFonts w:ascii="Wingdings" w:hAnsi="Wingdings" w:hint="default"/>
+      </w:rPr>
+    </w:lvl>
+    <w:lvl w:ilvl="6" w:tplc="20000001" w:tentative="1">
+      <w:start w:val="1"/>
+      <w:numFmt w:val="bullet"/>
+      <w:lvlText w:val=""/>
+      <w:lvlJc w:val="left"/>
+      <w:pPr>
+        <w:ind w:left="5040" w:hanging="360"/>
+      </w:pPr>
+      <w:rPr>
+        <w:rFonts w:ascii="Symbol" w:hAnsi="Symbol" w:hint="default"/>
+      </w:rPr>
+    </w:lvl>
+    <w:lvl w:ilvl="7" w:tplc="20000003" w:tentative="1">
+      <w:start w:val="1"/>
+      <w:numFmt w:val="bullet"/>
+      <w:lvlText w:val="o"/>
+      <w:lvlJc w:val="left"/>
+      <w:pPr>
+        <w:ind w:left="5760" w:hanging="360"/>
+      </w:pPr>
+      <w:rPr>
+        <w:rFonts w:ascii="Courier New" w:hAnsi="Courier New" w:cs="Courier New" w:hint="default"/>
+      </w:rPr>
+    </w:lvl>
+    <w:lvl w:ilvl="8" w:tplc="20000005" w:tentative="1">
+      <w:start w:val="1"/>
+      <w:numFmt w:val="bullet"/>
+      <w:lvlText w:val=""/>
+      <w:lvlJc w:val="left"/>
+      <w:pPr>
+        <w:ind w:left="6480" w:hanging="360"/>
+      </w:pPr>
+      <w:rPr>
+        <w:rFonts w:ascii="Wingdings" w:hAnsi="Wingdings" w:hint="default"/>
+      </w:rPr>
+    </w:lvl>
+  </w:abstractNum>
+  <w:num w:numId="1" w16cid:durableId="958024723">
+    <w:abstractNumId w:val="0"/>
+  </w:num>
+</w:numbering>
 </file>
 
 <file path=word/styles.xml><?xml version="1.0" encoding="utf-8"?>
@@ -2422,6 +2586,7 @@
   <w:style w:type="character" w:default="1" w:styleId="DefaultParagraphFont">
     <w:name w:val="Default Paragraph Font"/>
     <w:uiPriority w:val="1"/>
+    <w:semiHidden/>
     <w:unhideWhenUsed/>
   </w:style>
   <w:style w:type="table" w:default="1" w:styleId="TableNormal">
@@ -2872,6 +3037,27 @@
     <w:family w:val="roman"/>
     <w:pitch w:val="variable"/>
     <w:sig w:usb0="E0002EFF" w:usb1="C000785B" w:usb2="00000009" w:usb3="00000000" w:csb0="000001FF" w:csb1="00000000"/>
+  </w:font>
+  <w:font w:name="Courier New">
+    <w:panose1 w:val="02070309020205020404"/>
+    <w:charset w:val="00"/>
+    <w:family w:val="modern"/>
+    <w:pitch w:val="fixed"/>
+    <w:sig w:usb0="E0002EFF" w:usb1="C0007843" w:usb2="00000009" w:usb3="00000000" w:csb0="000001FF" w:csb1="00000000"/>
+  </w:font>
+  <w:font w:name="Wingdings">
+    <w:panose1 w:val="05000000000000000000"/>
+    <w:charset w:val="02"/>
+    <w:family w:val="auto"/>
+    <w:pitch w:val="variable"/>
+    <w:sig w:usb0="00000000" w:usb1="10000000" w:usb2="00000000" w:usb3="00000000" w:csb0="80000000" w:csb1="00000000"/>
+  </w:font>
+  <w:font w:name="Symbol">
+    <w:panose1 w:val="05050102010706020507"/>
+    <w:charset w:val="02"/>
+    <w:family w:val="roman"/>
+    <w:pitch w:val="variable"/>
+    <w:sig w:usb0="00000000" w:usb1="10000000" w:usb2="00000000" w:usb3="00000000" w:csb0="80000000" w:csb1="00000000"/>
   </w:font>
   <w:font w:name="Aptos Display">
     <w:charset w:val="00"/>
@@ -2911,6 +3097,8 @@
     <w:rsid w:val="008B022A"/>
     <w:rsid w:val="00937E16"/>
     <w:rsid w:val="00C35DAB"/>
+    <w:rsid w:val="00DD2381"/>
+    <w:rsid w:val="00ED4B32"/>
     <w:rsid w:val="00ED73F4"/>
   </w:rsids>
   <m:mathPr>

</xml_diff>